<commit_message>
Remove SBD-TIME01: the PDC emulator is the domain's time source
- Course 1.2 lesson 5 becomes "Make SBD-DC01 the domain's time source":
  mark the PDC emulator reliable, serving its own clock; turn off hypervisor
  time sync for the DC VMs; document how the clock is checked; verify the
  hierarchy. New quiz on hypervisor time sync; workbook, checklist and PDF
  refreshed. Same lesson ID, so saved progress carries over.
- Inside the Network: drop the TIME01 system, its rack appliance and rule
  F08; DC01 carries AU-8/SC-45 and the time design. Regenerate the traffic
  matrix, implementation plan and text version; update model checks.
- Drop F08 from the RMF capstone's rule list; record the decision in AGENTS.md.

Co-Authored-By: Claude Opus 5.5 <noreply@anthropic.com>
Claude-Session: https://claude.ai/code/session_01KXpABti7gZjF9vATjgu9Pb
</commit_message>
<xml_diff>
--- a/public/training/dns-configuration/SecureByDesign-dns-configuration-Workbook.docx
+++ b/public/training/dns-configuration/SecureByDesign-dns-configuration-Workbook.docx
@@ -136,7 +136,7 @@
           <w:sz w:val="21"/>
           <w:szCs w:val="21"/>
         </w:rPr>
-        <w:t xml:space="preserve">Build dependable internal name resolution and time on DC01 and DC02. Configure forward and reverse zones, manage service records, point the domain at the internal reference clock, and prove both in the air-gapped training network.</w:t>
+        <w:t xml:space="preserve">Build dependable internal name resolution and time on DC01 and DC02. Configure forward and reverse zones, manage service records, make the PDC emulator the domain's time source, and prove both in the air-gapped training network.</w:t>
       </w:r>
     </w:p>
     <w:p>
@@ -327,7 +327,7 @@
             <w:sz w:val="21"/>
             <w:szCs w:val="21"/>
           </w:rPr>
-          <w:t xml:space="preserve">05  Stand up SBD-TIME01 and the time hierarchy</w:t>
+          <w:t xml:space="preserve">05  Make SBD-DC01 the domain's time source</w:t>
         </w:r>
       </w:hyperlink>
     </w:p>
@@ -444,7 +444,7 @@
           <w:sz w:val="21"/>
           <w:szCs w:val="21"/>
         </w:rPr>
-        <w:t xml:space="preserve">The addresses and names below continue the training example. Match every change to your own address plan. This network has no internet DNS or time dependency: names resolve on the domain controllers, and time comes from the internal reference clock, SBD-TIME01.</w:t>
+        <w:t xml:space="preserve">The addresses and names below continue the training example. Match every change to your own address plan. This network has no internet DNS or time dependency: names resolve on the domain controllers, and time comes from the PDC emulator, SBD-DC01.</w:t>
       </w:r>
     </w:p>
     <w:p>
@@ -538,7 +538,7 @@
           <w:sz w:val="21"/>
           <w:szCs w:val="21"/>
         </w:rPr>
-        <w:t xml:space="preserve">The network's routing and VLAN segmentation are already in place, with a documented service-path register; SBD-TIME01 answers at 10.0.20.40 (a stand-in Windows Server 2025 host is fine in a practice lab).</w:t>
+        <w:t xml:space="preserve">The network's routing and VLAN segmentation are already in place, with a documented service-path register.</w:t>
       </w:r>
     </w:p>
     <w:p>
@@ -632,7 +632,7 @@
           <w:sz w:val="21"/>
           <w:szCs w:val="21"/>
         </w:rPr>
-        <w:t xml:space="preserve">Point the PDC emulator at SBD-TIME01 and verify the domain time hierarchy end to end.</w:t>
+        <w:t xml:space="preserve">Make the PDC emulator the domain's time source and verify the time hierarchy end to end.</w:t>
       </w:r>
     </w:p>
     <w:p>
@@ -868,75 +868,6 @@
           </w:p>
         </w:tc>
       </w:tr>
-      <w:tr>
-        <w:trPr>
-          <w:cantSplit/>
-        </w:trPr>
-        <w:tc>
-          <w:tcPr>
-            <w:tcW w:type="dxa" w:w="3000"/>
-            <w:tcMar>
-              <w:top w:type="dxa" w:w="90"/>
-              <w:left w:type="dxa" w:w="120"/>
-              <w:bottom w:type="dxa" w:w="90"/>
-              <w:right w:type="dxa" w:w="120"/>
-            </w:tcMar>
-          </w:tcPr>
-          <w:p>
-            <w:pPr>
-              <w:spacing w:after="0" w:before="0" w:line="288" w:lineRule="auto"/>
-            </w:pPr>
-            <w:r>
-              <w:rPr>
-                <w:rFonts w:ascii="Arial" w:cs="Arial" w:eastAsia="Arial" w:hAnsi="Arial"/>
-                <w:color w:val="193448"/>
-                <w:sz w:val="19"/>
-                <w:szCs w:val="19"/>
-              </w:rPr>
-              <w:t xml:space="preserve">SBD-TIME01 — name, address, OS build</w:t>
-            </w:r>
-          </w:p>
-        </w:tc>
-        <w:tc>
-          <w:tcPr>
-            <w:tcW w:type="dxa" w:w="6360"/>
-            <w:tcMar>
-              <w:top w:type="dxa" w:w="90"/>
-              <w:left w:type="dxa" w:w="120"/>
-              <w:bottom w:type="dxa" w:w="90"/>
-              <w:right w:type="dxa" w:w="120"/>
-            </w:tcMar>
-          </w:tcPr>
-          <w:p>
-            <w:pPr>
-              <w:spacing w:after="0" w:before="0" w:line="288" w:lineRule="auto"/>
-            </w:pPr>
-            <w:r>
-              <w:rPr>
-                <w:rFonts w:ascii="Arial" w:cs="Arial" w:eastAsia="Arial" w:hAnsi="Arial"/>
-                <w:color w:val="193448"/>
-                <w:sz w:val="21"/>
-                <w:szCs w:val="21"/>
-              </w:rPr>
-              <w:t xml:space="preserve"> </w:t>
-            </w:r>
-          </w:p>
-          <w:p>
-            <w:pPr>
-              <w:spacing w:after="0" w:before="0" w:line="288" w:lineRule="auto"/>
-            </w:pPr>
-            <w:r>
-              <w:rPr>
-                <w:rFonts w:ascii="Arial" w:cs="Arial" w:eastAsia="Arial" w:hAnsi="Arial"/>
-                <w:color w:val="193448"/>
-                <w:sz w:val="21"/>
-                <w:szCs w:val="21"/>
-              </w:rPr>
-              <w:t xml:space="preserve"> </w:t>
-            </w:r>
-          </w:p>
-        </w:tc>
-      </w:tr>
     </w:tbl>
     <w:p>
       <w:r>
@@ -4745,7 +4676,7 @@
           <w:sz w:val="16"/>
           <w:szCs w:val="16"/>
         </w:rPr>
-        <w:t xml:space="preserve">LESSON 05  /  ABOUT 35 MIN</w:t>
+        <w:t xml:space="preserve">LESSON 05  /  ABOUT 30 MIN</w:t>
       </w:r>
     </w:p>
     <w:p>
@@ -4763,7 +4694,7 @@
           <w:sz w:val="40"/>
           <w:szCs w:val="40"/>
         </w:rPr>
-        <w:t xml:space="preserve">Stand up SBD-TIME01 and the time hierarchy</w:t>
+        <w:t xml:space="preserve">Make SBD-DC01 the domain's time source</w:t>
       </w:r>
       <w:bookmarkEnd w:id="9"/>
     </w:p>
@@ -4794,7 +4725,7 @@
           <w:sz w:val="20"/>
           <w:szCs w:val="20"/>
         </w:rPr>
-        <w:t xml:space="preserve">Kerberos tolerates minutes of skew, not more, and an air-gapped network has no internet time to lean on. Point the PDC emulator at the internal reference clock, SBD-TIME01, and let the domain hierarchy carry time to everything else.</w:t>
+        <w:t xml:space="preserve">Kerberos tolerates minutes of skew, not more, and an air-gapped network has no internet time to lean on. Make the PDC emulator, SBD-DC01, the domain's authoritative time source and let the domain hierarchy carry its time to everything else.</w:t>
       </w:r>
     </w:p>
     <w:p>
@@ -4831,7 +4762,7 @@
           <w:sz w:val="21"/>
           <w:szCs w:val="21"/>
         </w:rPr>
-        <w:t xml:space="preserve">Confirm SBD-TIME01 is serving as the network's internal reference clock.</w:t>
+        <w:t xml:space="preserve">Configure SBD-DC01, the PDC emulator, as the domain's reliable time source.</w:t>
       </w:r>
     </w:p>
     <w:p>
@@ -4850,7 +4781,7 @@
           <w:sz w:val="21"/>
           <w:szCs w:val="21"/>
         </w:rPr>
-        <w:t xml:space="preserve">Point the PDC emulator at it and keep the rest on the domain hierarchy.</w:t>
+        <w:t xml:space="preserve">Keep every other system on the domain hierarchy, with nothing overriding it.</w:t>
       </w:r>
     </w:p>
     <w:p>
@@ -4869,7 +4800,7 @@
           <w:sz w:val="21"/>
           <w:szCs w:val="21"/>
         </w:rPr>
-        <w:t xml:space="preserve">Document the accuracy, fallback, and drift decisions the model calls for.</w:t>
+        <w:t xml:space="preserve">Document how DC01's clock is set and checked, and the drift threshold the model calls for.</w:t>
       </w:r>
     </w:p>
     <w:p>
@@ -4906,7 +4837,7 @@
           <w:sz w:val="21"/>
           <w:szCs w:val="21"/>
         </w:rPr>
-        <w:t xml:space="preserve">Confirm SBD-TIME01 at 10.0.20.40 answers as an NTP server. In the model it is a rack appliance; in a practice lab a small Windows Server 2025 host with the Windows Time service configured as an NTP server can stand in for it. In an air-gapped network its clock is the reference by declaration — record the source decision (an approved hardware source, or the stand-in host's clock) with its expected accuracy and drift threshold.</w:t>
+        <w:t xml:space="preserve">Confirm which domain controller holds the PDC emulator role — SBD-DC01 in this sample. The PDC emulator of the forest root domain sits at the top of the Windows Time hierarchy, so it is the one system you configure; everything else follows it.</w:t>
       </w:r>
     </w:p>
     <w:p>
@@ -4925,7 +4856,7 @@
           <w:sz w:val="21"/>
           <w:szCs w:val="21"/>
         </w:rPr>
-        <w:t xml:space="preserve">On SBD-DC01, the domain controller holding the PDC emulator role, configure Windows Time to use SBD-TIME01 as its manual peer and mark it reliable. Only the PDC emulator points at TIME01: SBD-DC02 syncs from the PDC emulator, every other domain member keeps the default domain-hierarchy sync from the domain controllers, and the domain-joined Linux servers in later courses point chrony or ntpd at both domain controllers.</w:t>
+        <w:t xml:space="preserve">On SBD-DC01, mark Windows Time as a reliable time source with no external peer, so it serves time from its own clock. In an air-gapped network that clock is the reference by declaration: record how it is set and checked — for example, compared on a schedule against an approved reference and corrected by an administrator, with each correction recorded — and the drift threshold you will hold it to.</w:t>
       </w:r>
     </w:p>
     <w:p>
@@ -4944,7 +4875,7 @@
           <w:sz w:val="21"/>
           <w:szCs w:val="21"/>
         </w:rPr>
-        <w:t xml:space="preserve">Confirm the network's service-path register permits time — members to both domain controllers on UDP 123, and SBD-DC01 alone to SBD-TIME01. Write the time design into the build record now: course 1.3's hardening Group Policy objects (GPOs) must leave it intact, and if a Security Technical Implementation Guide (STIG) value disagrees with it, that course's deviation record is where the decision lives.</w:t>
+        <w:t xml:space="preserve">Turn off the hypervisor's time synchronization for both domain controller virtual machines, so the host clock cannot silently override the PDC emulator. SBD-DC02 syncs from the PDC emulator, every other domain member keeps the default domain-hierarchy sync from the domain controllers, and the domain-joined Linux servers in later courses point chrony or ntpd at both domain controllers.</w:t>
       </w:r>
     </w:p>
     <w:p>
@@ -4963,7 +4894,26 @@
           <w:sz w:val="21"/>
           <w:szCs w:val="21"/>
         </w:rPr>
-        <w:t xml:space="preserve">Verify the chain end to end: TIME01 serving, the PDC emulator sourcing from it, SBD-DC02 and a member server sourcing from a domain controller, and offsets within your recorded threshold.</w:t>
+        <w:t xml:space="preserve">Confirm the network's service-path register permits time — every member to both domain controllers on UDP 123 — and write the time design into the build record: course 1.3's hardening Group Policy objects (GPOs) must leave it intact, and if a Security Technical Implementation Guide (STIG) value disagrees with it, that course's deviation record is where the decision lives.</w:t>
+      </w:r>
+    </w:p>
+    <w:p>
+      <w:pPr>
+        <w:pStyle w:val="ListParagraph"/>
+        <w:numPr>
+          <w:ilvl w:val="0"/>
+          <w:numId w:val="9"/>
+        </w:numPr>
+        <w:spacing w:after="120" w:before="0" w:line="288" w:lineRule="auto"/>
+      </w:pPr>
+      <w:r>
+        <w:rPr>
+          <w:rFonts w:ascii="Arial" w:cs="Arial" w:eastAsia="Arial" w:hAnsi="Arial"/>
+          <w:color w:val="526B7E"/>
+          <w:sz w:val="21"/>
+          <w:szCs w:val="21"/>
+        </w:rPr>
+        <w:t xml:space="preserve">Verify the chain end to end: SBD-DC01 serving as the reliable source, SBD-DC02 and a member server sourcing from a domain controller, and offsets within your recorded threshold.</w:t>
       </w:r>
     </w:p>
     <w:p>
@@ -5013,7 +4963,7 @@
           <w:sz w:val="18"/>
           <w:szCs w:val="18"/>
         </w:rPr>
-        <w:t xml:space="preserve"># On the PDC emulator, then on SBD-DC02 and a member server:</w:t>
+        <w:t xml:space="preserve"># On SBD-DC01 (the PDC emulator): serve time from its own clock as the reliable source</w:t>
       </w:r>
     </w:p>
     <w:p>
@@ -5029,7 +4979,7 @@
           <w:sz w:val="18"/>
           <w:szCs w:val="18"/>
         </w:rPr>
-        <w:t xml:space="preserve">w32tm /query /source</w:t>
+        <w:t xml:space="preserve">w32tm /config /reliable:yes /update</w:t>
       </w:r>
     </w:p>
     <w:p>
@@ -5045,6 +4995,70 @@
           <w:sz w:val="18"/>
           <w:szCs w:val="18"/>
         </w:rPr>
+        <w:t xml:space="preserve">Restart-Service w32time</w:t>
+      </w:r>
+    </w:p>
+    <w:p>
+      <w:pPr>
+        <w:shd w:fill="F1F7FA" w:color="auto" w:val="clear"/>
+        <w:spacing w:after="0" w:before="0" w:line="252" w:lineRule="auto"/>
+        <w:ind w:left="160" w:right="160"/>
+      </w:pPr>
+      <w:r>
+        <w:rPr>
+          <w:rFonts w:ascii="Consolas" w:cs="Consolas" w:eastAsia="Consolas" w:hAnsi="Consolas"/>
+          <w:color w:val="193448"/>
+          <w:sz w:val="18"/>
+          <w:szCs w:val="18"/>
+        </w:rPr>
+        <w:t xml:space="preserve">w32tm /query /source   # on SBD-DC01: Local CMOS Clock</w:t>
+      </w:r>
+    </w:p>
+    <w:p>
+      <w:pPr>
+        <w:shd w:fill="F1F7FA" w:color="auto" w:val="clear"/>
+        <w:spacing w:after="0" w:before="0" w:line="252" w:lineRule="auto"/>
+        <w:ind w:left="160" w:right="160"/>
+      </w:pPr>
+      <w:r>
+        <w:rPr>
+          <w:rFonts w:ascii="Consolas" w:cs="Consolas" w:eastAsia="Consolas" w:hAnsi="Consolas"/>
+          <w:color w:val="193448"/>
+          <w:sz w:val="18"/>
+          <w:szCs w:val="18"/>
+        </w:rPr>
+        <w:t xml:space="preserve"># On SBD-DC02 and a member server:</w:t>
+      </w:r>
+    </w:p>
+    <w:p>
+      <w:pPr>
+        <w:shd w:fill="F1F7FA" w:color="auto" w:val="clear"/>
+        <w:spacing w:after="0" w:before="0" w:line="252" w:lineRule="auto"/>
+        <w:ind w:left="160" w:right="160"/>
+      </w:pPr>
+      <w:r>
+        <w:rPr>
+          <w:rFonts w:ascii="Consolas" w:cs="Consolas" w:eastAsia="Consolas" w:hAnsi="Consolas"/>
+          <w:color w:val="193448"/>
+          <w:sz w:val="18"/>
+          <w:szCs w:val="18"/>
+        </w:rPr>
+        <w:t xml:space="preserve">w32tm /query /source   # expected: a domain controller</w:t>
+      </w:r>
+    </w:p>
+    <w:p>
+      <w:pPr>
+        <w:shd w:fill="F1F7FA" w:color="auto" w:val="clear"/>
+        <w:spacing w:after="0" w:before="0" w:line="252" w:lineRule="auto"/>
+        <w:ind w:left="160" w:right="160"/>
+      </w:pPr>
+      <w:r>
+        <w:rPr>
+          <w:rFonts w:ascii="Consolas" w:cs="Consolas" w:eastAsia="Consolas" w:hAnsi="Consolas"/>
+          <w:color w:val="193448"/>
+          <w:sz w:val="18"/>
+          <w:szCs w:val="18"/>
+        </w:rPr>
         <w:t xml:space="preserve">w32tm /query /status</w:t>
       </w:r>
     </w:p>
@@ -5061,7 +5075,7 @@
           <w:sz w:val="18"/>
           <w:szCs w:val="18"/>
         </w:rPr>
-        <w:t xml:space="preserve">w32tm /stripchart /computer:10.0.20.40 /samples:3 /dataonly   # from SBD-DC01 only</w:t>
+        <w:t xml:space="preserve">w32tm /stripchart /computer:SBD-DC01.sbd.test /samples:3 /dataonly</w:t>
       </w:r>
     </w:p>
     <w:p>
@@ -5091,7 +5105,7 @@
           <w:sz w:val="20"/>
           <w:szCs w:val="20"/>
         </w:rPr>
-        <w:t xml:space="preserve">The PDC emulator reports SBD-TIME01 as its source, SBD-DC02 and the member server report a domain controller, and measured offsets sit inside the documented threshold.</w:t>
+        <w:t xml:space="preserve">SBD-DC01 reports itself as the reliable source (Local CMOS Clock), SBD-DC02 and the member server report a domain controller, host time synchronization is off for both domain controllers, and measured offsets sit inside the documented threshold.</w:t>
       </w:r>
     </w:p>
     <w:p>
@@ -5123,7 +5137,7 @@
           <w:sz w:val="21"/>
           <w:szCs w:val="21"/>
         </w:rPr>
-        <w:t xml:space="preserve">Evidence to keep: Record the time design decisions, the source and status output from both controllers and the member, the stripchart offsets, and the register rows that permit time: members to the domain controllers, and SBD-DC01 to SBD-TIME01.</w:t>
+        <w:t xml:space="preserve">Evidence to keep: Record the time design decisions (how DC01's clock is set and checked, and the drift threshold), the source and status output from both controllers and the member, the stripchart offsets, the hypervisor setting for both domain controller VMs, and the register rows that permit time: every member to the domain controllers.</w:t>
       </w:r>
     </w:p>
     <w:tbl>
@@ -5578,7 +5592,7 @@
           <w:sz w:val="21"/>
           <w:szCs w:val="21"/>
         </w:rPr>
-        <w:t xml:space="preserve">Which system syncs directly with SBD-TIME01?</w:t>
+        <w:t xml:space="preserve">Which system is the domain's authoritative time source in this design?</w:t>
       </w:r>
     </w:p>
     <w:p>
@@ -5670,7 +5684,7 @@
           <w:sz w:val="20"/>
           <w:szCs w:val="20"/>
         </w:rPr>
-        <w:t xml:space="preserve">TIME01 is the declared reference; its accuracy decisions are written down.  Only the PDC emulator peers with it; the hierarchy carries the rest.  Offsets are measured and inside the threshold, not assumed.</w:t>
+        <w:t xml:space="preserve">SBD-DC01, the PDC emulator, is the declared source; how its clock is checked is written down.  The hypervisor no longer overrides domain controller time; the hierarchy carries it everywhere.  Offsets are measured and inside the threshold, not assumed.</w:t>
       </w:r>
     </w:p>
     <w:p>
@@ -7194,7 +7208,7 @@
                 <w:sz w:val="19"/>
                 <w:szCs w:val="19"/>
               </w:rPr>
-              <w:t xml:space="preserve">05  Stand up SBD-TIME01 and the time hierarchy</w:t>
+              <w:t xml:space="preserve">05  Make SBD-DC01 the domain's time source</w:t>
             </w:r>
           </w:p>
         </w:tc>

</xml_diff>